<commit_message>
docs: update authors to Arya Tirta, Muhammad Zaidan Habibi, and Muhamad Wildan Muzaqi in docx
</commit_message>
<xml_diff>
--- a/docs/LAPORAN_TUGAS_OOP.docx
+++ b/docs/LAPORAN_TUGAS_OOP.docx
@@ -654,7 +654,7 @@
                 <w:color w:val="262626"/>
                 <w:sz w:val="19"/>
               </w:rPr>
-              <w:t>Dhia Athalla</w:t>
+              <w:t>Arya Tirta</w:t>
             </w:r>
           </w:p>
         </w:tc>
@@ -680,7 +680,7 @@
                 <w:color w:val="262626"/>
                 <w:sz w:val="19"/>
               </w:rPr>
-              <w:t>225443006</w:t>
+              <w:t>225443005</w:t>
             </w:r>
           </w:p>
         </w:tc>
@@ -706,7 +706,7 @@
                 <w:color w:val="262626"/>
                 <w:sz w:val="19"/>
               </w:rPr>
-              <w:t>Project Lead &amp; Business Logic Developer</w:t>
+              <w:t>Project Lead &amp; Core Architect</w:t>
             </w:r>
           </w:p>
         </w:tc>
@@ -714,201 +714,6 @@
           <w:tcPr>
             <w:tcW w:type="dxa" w:w="1872"/>
             <w:shd w:fill="F9FAFB"/>
-            <w:tcBorders>
-              <w:top w:val="single" w:sz="4" w:space="0" w:color="D0D7DE"/>
-              <w:left w:val="single" w:sz="4" w:space="0" w:color="D0D7DE"/>
-              <w:bottom w:val="single" w:sz="4" w:space="0" w:color="D0D7DE"/>
-              <w:right w:val="single" w:sz="4" w:space="0" w:color="D0D7DE"/>
-            </w:tcBorders>
-          </w:tcPr>
-          <w:p>
-            <w:pPr>
-              <w:spacing w:before="60" w:after="60" w:line="252" w:lineRule="auto"/>
-            </w:pPr>
-            <w:r>
-              <w:rPr>
-                <w:rFonts w:ascii="Calibri" w:hAnsi="Calibri"/>
-                <w:b w:val="0"/>
-                <w:color w:val="262626"/>
-                <w:sz w:val="19"/>
-              </w:rPr>
-              <w:t xml:space="preserve">Singleton </w:t>
-            </w:r>
-            <w:r>
-              <w:rPr>
-                <w:rFonts w:ascii="Consolas" w:hAnsi="Consolas"/>
-                <w:b/>
-                <w:color w:val="9E1C23"/>
-                <w:sz w:val="18"/>
-              </w:rPr>
-              <w:t>LibraryManager.kt</w:t>
-            </w:r>
-            <w:r>
-              <w:rPr>
-                <w:rFonts w:ascii="Calibri" w:hAnsi="Calibri"/>
-                <w:b w:val="0"/>
-                <w:color w:val="262626"/>
-                <w:sz w:val="19"/>
-              </w:rPr>
-              <w:t xml:space="preserve"> (Validasi Bisnis &amp; </w:t>
-            </w:r>
-            <w:r>
-              <w:rPr>
-                <w:rFonts w:ascii="Consolas" w:hAnsi="Consolas"/>
-                <w:b/>
-                <w:color w:val="9E1C23"/>
-                <w:sz w:val="18"/>
-              </w:rPr>
-              <w:t>runCatching</w:t>
-            </w:r>
-            <w:r>
-              <w:rPr>
-                <w:rFonts w:ascii="Calibri" w:hAnsi="Calibri"/>
-                <w:b w:val="0"/>
-                <w:color w:val="262626"/>
-                <w:sz w:val="19"/>
-              </w:rPr>
-              <w:t xml:space="preserve">), </w:t>
-            </w:r>
-            <w:r>
-              <w:rPr>
-                <w:rFonts w:ascii="Consolas" w:hAnsi="Consolas"/>
-                <w:b/>
-                <w:color w:val="9E1C23"/>
-                <w:sz w:val="18"/>
-              </w:rPr>
-              <w:t>CustomExceptions.kt</w:t>
-            </w:r>
-            <w:r>
-              <w:rPr>
-                <w:rFonts w:ascii="Calibri" w:hAnsi="Calibri"/>
-                <w:b w:val="0"/>
-                <w:color w:val="262626"/>
-                <w:sz w:val="19"/>
-              </w:rPr>
-              <w:t xml:space="preserve">, dan Skenario Runner </w:t>
-            </w:r>
-            <w:r>
-              <w:rPr>
-                <w:rFonts w:ascii="Consolas" w:hAnsi="Consolas"/>
-                <w:b/>
-                <w:color w:val="9E1C23"/>
-                <w:sz w:val="18"/>
-              </w:rPr>
-              <w:t>Main.kt</w:t>
-            </w:r>
-          </w:p>
-        </w:tc>
-      </w:tr>
-      <w:tr>
-        <w:tc>
-          <w:tcPr>
-            <w:tcW w:type="dxa" w:w="1872"/>
-            <w:shd w:fill="FFFFFF"/>
-            <w:tcBorders>
-              <w:top w:val="single" w:sz="4" w:space="0" w:color="D0D7DE"/>
-              <w:left w:val="single" w:sz="4" w:space="0" w:color="D0D7DE"/>
-              <w:bottom w:val="single" w:sz="4" w:space="0" w:color="D0D7DE"/>
-              <w:right w:val="single" w:sz="4" w:space="0" w:color="D0D7DE"/>
-            </w:tcBorders>
-          </w:tcPr>
-          <w:p>
-            <w:pPr>
-              <w:spacing w:before="60" w:after="60" w:line="252" w:lineRule="auto"/>
-            </w:pPr>
-            <w:r>
-              <w:rPr>
-                <w:rFonts w:ascii="Calibri" w:hAnsi="Calibri"/>
-                <w:b w:val="0"/>
-                <w:color w:val="262626"/>
-                <w:sz w:val="19"/>
-              </w:rPr>
-              <w:t>2</w:t>
-            </w:r>
-          </w:p>
-        </w:tc>
-        <w:tc>
-          <w:tcPr>
-            <w:tcW w:type="dxa" w:w="1872"/>
-            <w:shd w:fill="FFFFFF"/>
-            <w:tcBorders>
-              <w:top w:val="single" w:sz="4" w:space="0" w:color="D0D7DE"/>
-              <w:left w:val="single" w:sz="4" w:space="0" w:color="D0D7DE"/>
-              <w:bottom w:val="single" w:sz="4" w:space="0" w:color="D0D7DE"/>
-              <w:right w:val="single" w:sz="4" w:space="0" w:color="D0D7DE"/>
-            </w:tcBorders>
-          </w:tcPr>
-          <w:p>
-            <w:pPr>
-              <w:spacing w:before="60" w:after="60" w:line="252" w:lineRule="auto"/>
-            </w:pPr>
-            <w:r>
-              <w:rPr>
-                <w:rFonts w:ascii="Calibri" w:hAnsi="Calibri"/>
-                <w:b/>
-                <w:color w:val="262626"/>
-                <w:sz w:val="19"/>
-              </w:rPr>
-              <w:t>Josua Pardamean Simangunsong</w:t>
-            </w:r>
-          </w:p>
-        </w:tc>
-        <w:tc>
-          <w:tcPr>
-            <w:tcW w:type="dxa" w:w="1872"/>
-            <w:shd w:fill="FFFFFF"/>
-            <w:tcBorders>
-              <w:top w:val="single" w:sz="4" w:space="0" w:color="D0D7DE"/>
-              <w:left w:val="single" w:sz="4" w:space="0" w:color="D0D7DE"/>
-              <w:bottom w:val="single" w:sz="4" w:space="0" w:color="D0D7DE"/>
-              <w:right w:val="single" w:sz="4" w:space="0" w:color="D0D7DE"/>
-            </w:tcBorders>
-          </w:tcPr>
-          <w:p>
-            <w:pPr>
-              <w:spacing w:before="60" w:after="60" w:line="252" w:lineRule="auto"/>
-            </w:pPr>
-            <w:r>
-              <w:rPr>
-                <w:rFonts w:ascii="Calibri" w:hAnsi="Calibri"/>
-                <w:b w:val="0"/>
-                <w:color w:val="262626"/>
-                <w:sz w:val="19"/>
-              </w:rPr>
-              <w:t>225443011</w:t>
-            </w:r>
-          </w:p>
-        </w:tc>
-        <w:tc>
-          <w:tcPr>
-            <w:tcW w:type="dxa" w:w="1872"/>
-            <w:shd w:fill="FFFFFF"/>
-            <w:tcBorders>
-              <w:top w:val="single" w:sz="4" w:space="0" w:color="D0D7DE"/>
-              <w:left w:val="single" w:sz="4" w:space="0" w:color="D0D7DE"/>
-              <w:bottom w:val="single" w:sz="4" w:space="0" w:color="D0D7DE"/>
-              <w:right w:val="single" w:sz="4" w:space="0" w:color="D0D7DE"/>
-            </w:tcBorders>
-          </w:tcPr>
-          <w:p>
-            <w:pPr>
-              <w:spacing w:before="60" w:after="60" w:line="252" w:lineRule="auto"/>
-            </w:pPr>
-            <w:r>
-              <w:rPr>
-                <w:rFonts w:ascii="Calibri" w:hAnsi="Calibri"/>
-                <w:b/>
-                <w:color w:val="262626"/>
-                <w:sz w:val="19"/>
-              </w:rPr>
-              <w:t>Core Architect &amp; Book-Magazine Developer</w:t>
-            </w:r>
-          </w:p>
-        </w:tc>
-        <w:tc>
-          <w:tcPr>
-            <w:tcW w:type="dxa" w:w="1872"/>
-            <w:shd w:fill="FFFFFF"/>
             <w:tcBorders>
               <w:top w:val="single" w:sz="4" w:space="0" w:color="D0D7DE"/>
               <w:left w:val="single" w:sz="4" w:space="0" w:color="D0D7DE"/>
@@ -1017,7 +822,7 @@
         <w:tc>
           <w:tcPr>
             <w:tcW w:type="dxa" w:w="1872"/>
-            <w:shd w:fill="F9FAFB"/>
+            <w:shd w:fill="FFFFFF"/>
             <w:tcBorders>
               <w:top w:val="single" w:sz="4" w:space="0" w:color="D0D7DE"/>
               <w:left w:val="single" w:sz="4" w:space="0" w:color="D0D7DE"/>
@@ -1036,14 +841,14 @@
                 <w:color w:val="262626"/>
                 <w:sz w:val="19"/>
               </w:rPr>
-              <w:t>3</w:t>
+              <w:t>2</w:t>
             </w:r>
           </w:p>
         </w:tc>
         <w:tc>
           <w:tcPr>
             <w:tcW w:type="dxa" w:w="1872"/>
-            <w:shd w:fill="F9FAFB"/>
+            <w:shd w:fill="FFFFFF"/>
             <w:tcBorders>
               <w:top w:val="single" w:sz="4" w:space="0" w:color="D0D7DE"/>
               <w:left w:val="single" w:sz="4" w:space="0" w:color="D0D7DE"/>
@@ -1062,14 +867,14 @@
                 <w:color w:val="262626"/>
                 <w:sz w:val="19"/>
               </w:rPr>
-              <w:t>Muhammad Dhafin Rizqullah</w:t>
+              <w:t>Muhammad Zaidan Habibi</w:t>
             </w:r>
           </w:p>
         </w:tc>
         <w:tc>
           <w:tcPr>
             <w:tcW w:type="dxa" w:w="1872"/>
-            <w:shd w:fill="F9FAFB"/>
+            <w:shd w:fill="FFFFFF"/>
             <w:tcBorders>
               <w:top w:val="single" w:sz="4" w:space="0" w:color="D0D7DE"/>
               <w:left w:val="single" w:sz="4" w:space="0" w:color="D0D7DE"/>
@@ -1088,14 +893,14 @@
                 <w:color w:val="262626"/>
                 <w:sz w:val="19"/>
               </w:rPr>
-              <w:t>225443015</w:t>
+              <w:t>225443020</w:t>
             </w:r>
           </w:p>
         </w:tc>
         <w:tc>
           <w:tcPr>
             <w:tcW w:type="dxa" w:w="1872"/>
-            <w:shd w:fill="F9FAFB"/>
+            <w:shd w:fill="FFFFFF"/>
             <w:tcBorders>
               <w:top w:val="single" w:sz="4" w:space="0" w:color="D0D7DE"/>
               <w:left w:val="single" w:sz="4" w:space="0" w:color="D0D7DE"/>
@@ -1121,7 +926,7 @@
         <w:tc>
           <w:tcPr>
             <w:tcW w:type="dxa" w:w="1872"/>
-            <w:shd w:fill="F9FAFB"/>
+            <w:shd w:fill="FFFFFF"/>
             <w:tcBorders>
               <w:top w:val="single" w:sz="4" w:space="0" w:color="D0D7DE"/>
               <w:left w:val="single" w:sz="4" w:space="0" w:color="D0D7DE"/>
@@ -1187,6 +992,25 @@
               </w:rPr>
               <w:t>Repository.kt</w:t>
             </w:r>
+          </w:p>
+        </w:tc>
+      </w:tr>
+      <w:tr>
+        <w:tc>
+          <w:tcPr>
+            <w:tcW w:type="dxa" w:w="1872"/>
+            <w:shd w:fill="F9FAFB"/>
+            <w:tcBorders>
+              <w:top w:val="single" w:sz="4" w:space="0" w:color="D0D7DE"/>
+              <w:left w:val="single" w:sz="4" w:space="0" w:color="D0D7DE"/>
+              <w:bottom w:val="single" w:sz="4" w:space="0" w:color="D0D7DE"/>
+              <w:right w:val="single" w:sz="4" w:space="0" w:color="D0D7DE"/>
+            </w:tcBorders>
+          </w:tcPr>
+          <w:p>
+            <w:pPr>
+              <w:spacing w:before="60" w:after="60" w:line="252" w:lineRule="auto"/>
+            </w:pPr>
             <w:r>
               <w:rPr>
                 <w:rFonts w:ascii="Calibri" w:hAnsi="Calibri"/>
@@ -1194,7 +1018,183 @@
                 <w:color w:val="262626"/>
                 <w:sz w:val="19"/>
               </w:rPr>
-              <w:t>, Dokumentasi &amp; Pengujian</w:t>
+              <w:t>3</w:t>
+            </w:r>
+          </w:p>
+        </w:tc>
+        <w:tc>
+          <w:tcPr>
+            <w:tcW w:type="dxa" w:w="1872"/>
+            <w:shd w:fill="F9FAFB"/>
+            <w:tcBorders>
+              <w:top w:val="single" w:sz="4" w:space="0" w:color="D0D7DE"/>
+              <w:left w:val="single" w:sz="4" w:space="0" w:color="D0D7DE"/>
+              <w:bottom w:val="single" w:sz="4" w:space="0" w:color="D0D7DE"/>
+              <w:right w:val="single" w:sz="4" w:space="0" w:color="D0D7DE"/>
+            </w:tcBorders>
+          </w:tcPr>
+          <w:p>
+            <w:pPr>
+              <w:spacing w:before="60" w:after="60" w:line="252" w:lineRule="auto"/>
+            </w:pPr>
+            <w:r>
+              <w:rPr>
+                <w:rFonts w:ascii="Calibri" w:hAnsi="Calibri"/>
+                <w:b/>
+                <w:color w:val="262626"/>
+                <w:sz w:val="19"/>
+              </w:rPr>
+              <w:t>Muhamad Wildan Muzaqi</w:t>
+            </w:r>
+          </w:p>
+        </w:tc>
+        <w:tc>
+          <w:tcPr>
+            <w:tcW w:type="dxa" w:w="1872"/>
+            <w:shd w:fill="F9FAFB"/>
+            <w:tcBorders>
+              <w:top w:val="single" w:sz="4" w:space="0" w:color="D0D7DE"/>
+              <w:left w:val="single" w:sz="4" w:space="0" w:color="D0D7DE"/>
+              <w:bottom w:val="single" w:sz="4" w:space="0" w:color="D0D7DE"/>
+              <w:right w:val="single" w:sz="4" w:space="0" w:color="D0D7DE"/>
+            </w:tcBorders>
+          </w:tcPr>
+          <w:p>
+            <w:pPr>
+              <w:spacing w:before="60" w:after="60" w:line="252" w:lineRule="auto"/>
+            </w:pPr>
+            <w:r>
+              <w:rPr>
+                <w:rFonts w:ascii="Calibri" w:hAnsi="Calibri"/>
+                <w:b w:val="0"/>
+                <w:color w:val="262626"/>
+                <w:sz w:val="19"/>
+              </w:rPr>
+              <w:t>225443014</w:t>
+            </w:r>
+          </w:p>
+        </w:tc>
+        <w:tc>
+          <w:tcPr>
+            <w:tcW w:type="dxa" w:w="1872"/>
+            <w:shd w:fill="F9FAFB"/>
+            <w:tcBorders>
+              <w:top w:val="single" w:sz="4" w:space="0" w:color="D0D7DE"/>
+              <w:left w:val="single" w:sz="4" w:space="0" w:color="D0D7DE"/>
+              <w:bottom w:val="single" w:sz="4" w:space="0" w:color="D0D7DE"/>
+              <w:right w:val="single" w:sz="4" w:space="0" w:color="D0D7DE"/>
+            </w:tcBorders>
+          </w:tcPr>
+          <w:p>
+            <w:pPr>
+              <w:spacing w:before="60" w:after="60" w:line="252" w:lineRule="auto"/>
+            </w:pPr>
+            <w:r>
+              <w:rPr>
+                <w:rFonts w:ascii="Calibri" w:hAnsi="Calibri"/>
+                <w:b/>
+                <w:color w:val="262626"/>
+                <w:sz w:val="19"/>
+              </w:rPr>
+              <w:t>Business Logic, Error Handling &amp; Doc Lead</w:t>
+            </w:r>
+          </w:p>
+        </w:tc>
+        <w:tc>
+          <w:tcPr>
+            <w:tcW w:type="dxa" w:w="1872"/>
+            <w:shd w:fill="F9FAFB"/>
+            <w:tcBorders>
+              <w:top w:val="single" w:sz="4" w:space="0" w:color="D0D7DE"/>
+              <w:left w:val="single" w:sz="4" w:space="0" w:color="D0D7DE"/>
+              <w:bottom w:val="single" w:sz="4" w:space="0" w:color="D0D7DE"/>
+              <w:right w:val="single" w:sz="4" w:space="0" w:color="D0D7DE"/>
+            </w:tcBorders>
+          </w:tcPr>
+          <w:p>
+            <w:pPr>
+              <w:spacing w:before="60" w:after="60" w:line="252" w:lineRule="auto"/>
+            </w:pPr>
+            <w:r>
+              <w:rPr>
+                <w:rFonts w:ascii="Calibri" w:hAnsi="Calibri"/>
+                <w:b w:val="0"/>
+                <w:color w:val="262626"/>
+                <w:sz w:val="19"/>
+              </w:rPr>
+              <w:t xml:space="preserve">Singleton </w:t>
+            </w:r>
+            <w:r>
+              <w:rPr>
+                <w:rFonts w:ascii="Consolas" w:hAnsi="Consolas"/>
+                <w:b/>
+                <w:color w:val="9E1C23"/>
+                <w:sz w:val="18"/>
+              </w:rPr>
+              <w:t>LibraryManager.kt</w:t>
+            </w:r>
+            <w:r>
+              <w:rPr>
+                <w:rFonts w:ascii="Calibri" w:hAnsi="Calibri"/>
+                <w:b w:val="0"/>
+                <w:color w:val="262626"/>
+                <w:sz w:val="19"/>
+              </w:rPr>
+              <w:t xml:space="preserve"> (Validasi Bisnis &amp; </w:t>
+            </w:r>
+            <w:r>
+              <w:rPr>
+                <w:rFonts w:ascii="Consolas" w:hAnsi="Consolas"/>
+                <w:b/>
+                <w:color w:val="9E1C23"/>
+                <w:sz w:val="18"/>
+              </w:rPr>
+              <w:t>runCatching</w:t>
+            </w:r>
+            <w:r>
+              <w:rPr>
+                <w:rFonts w:ascii="Calibri" w:hAnsi="Calibri"/>
+                <w:b w:val="0"/>
+                <w:color w:val="262626"/>
+                <w:sz w:val="19"/>
+              </w:rPr>
+              <w:t xml:space="preserve">), </w:t>
+            </w:r>
+            <w:r>
+              <w:rPr>
+                <w:rFonts w:ascii="Consolas" w:hAnsi="Consolas"/>
+                <w:b/>
+                <w:color w:val="9E1C23"/>
+                <w:sz w:val="18"/>
+              </w:rPr>
+              <w:t>CustomExceptions.kt</w:t>
+            </w:r>
+            <w:r>
+              <w:rPr>
+                <w:rFonts w:ascii="Calibri" w:hAnsi="Calibri"/>
+                <w:b w:val="0"/>
+                <w:color w:val="262626"/>
+                <w:sz w:val="19"/>
+              </w:rPr>
+              <w:t xml:space="preserve">, Skenario Runner </w:t>
+            </w:r>
+            <w:r>
+              <w:rPr>
+                <w:rFonts w:ascii="Consolas" w:hAnsi="Consolas"/>
+                <w:b/>
+                <w:color w:val="9E1C23"/>
+                <w:sz w:val="18"/>
+              </w:rPr>
+              <w:t>Main.kt</w:t>
+            </w:r>
+            <w:r>
+              <w:rPr>
+                <w:rFonts w:ascii="Calibri" w:hAnsi="Calibri"/>
+                <w:b w:val="0"/>
+                <w:color w:val="262626"/>
+                <w:sz w:val="19"/>
+              </w:rPr>
+              <w:t>, dan Dokumen Laporan</w:t>
             </w:r>
           </w:p>
         </w:tc>

</xml_diff>